<commit_message>
docs: update project design documents
</commit_message>
<xml_diff>
--- a/doc/项目计划书.docx
+++ b/doc/项目计划书.docx
@@ -48,26 +48,6 @@
       </w:r>
     </w:p>
     <w:p/>
-    <w:p>
-      <w:pPr>
-        <w:jc w:val="center"/>
-        <w:rPr>
-          <w:rFonts w:hint="eastAsia" w:ascii="黑体" w:hAnsi="黑体" w:eastAsia="黑体"/>
-          <w:b/>
-          <w:sz w:val="56"/>
-          <w:lang w:val="en-US" w:eastAsia="zh-CN"/>
-        </w:rPr>
-      </w:pPr>
-      <w:r>
-        <w:rPr>
-          <w:rFonts w:hint="eastAsia" w:ascii="黑体" w:hAnsi="黑体" w:eastAsia="黑体"/>
-          <w:b/>
-          <w:sz w:val="56"/>
-          <w:lang w:val="en-US" w:eastAsia="zh-CN"/>
-        </w:rPr>
-        <w:t>王家兴</w:t>
-      </w:r>
-    </w:p>
     <w:p/>
     <w:p/>
     <w:p/>
@@ -5663,12 +5643,6 @@
             <w:insideH w:val="single" w:color="BFBFBF" w:sz="6" w:space="0"/>
             <w:insideV w:val="single" w:color="BFBFBF" w:sz="6" w:space="0"/>
           </w:tblBorders>
-          <w:tblCellMar>
-            <w:top w:w="0" w:type="dxa"/>
-            <w:left w:w="108" w:type="dxa"/>
-            <w:bottom w:w="0" w:type="dxa"/>
-            <w:right w:w="108" w:type="dxa"/>
-          </w:tblCellMar>
         </w:tblPrEx>
         <w:trPr>
           <w:jc w:val="center"/>
@@ -10313,12 +10287,6 @@
             <w:insideH w:val="single" w:color="BFBFBF" w:sz="6" w:space="0"/>
             <w:insideV w:val="single" w:color="BFBFBF" w:sz="6" w:space="0"/>
           </w:tblBorders>
-          <w:tblCellMar>
-            <w:top w:w="0" w:type="dxa"/>
-            <w:left w:w="108" w:type="dxa"/>
-            <w:bottom w:w="0" w:type="dxa"/>
-            <w:right w:w="108" w:type="dxa"/>
-          </w:tblCellMar>
         </w:tblPrEx>
         <w:trPr>
           <w:jc w:val="center"/>
@@ -11380,7 +11348,24 @@
                 <w:rFonts w:ascii="宋体" w:hAnsi="宋体" w:eastAsia="宋体"/>
                 <w:sz w:val="21"/>
               </w:rPr>
-              <w:t>数据库设计、后端功能实现</w:t>
+              <w:t>数据库设计、</w:t>
+            </w:r>
+            <w:r>
+              <w:rPr>
+                <w:rFonts w:hint="eastAsia"/>
+                <w:sz w:val="21"/>
+                <w:lang w:val="en-US" w:eastAsia="zh-CN"/>
+              </w:rPr>
+              <w:t>前</w:t>
+            </w:r>
+            <w:bookmarkStart w:id="36" w:name="_GoBack"/>
+            <w:bookmarkEnd w:id="36"/>
+            <w:r>
+              <w:rPr>
+                <w:rFonts w:ascii="宋体" w:hAnsi="宋体" w:eastAsia="宋体"/>
+                <w:sz w:val="21"/>
+              </w:rPr>
+              <w:t>端功能实现</w:t>
             </w:r>
           </w:p>
         </w:tc>
@@ -13859,12 +13844,6 @@
             <w:insideH w:val="single" w:color="BFBFBF" w:sz="6" w:space="0"/>
             <w:insideV w:val="single" w:color="BFBFBF" w:sz="6" w:space="0"/>
           </w:tblBorders>
-          <w:tblCellMar>
-            <w:top w:w="0" w:type="dxa"/>
-            <w:left w:w="108" w:type="dxa"/>
-            <w:bottom w:w="0" w:type="dxa"/>
-            <w:right w:w="108" w:type="dxa"/>
-          </w:tblCellMar>
         </w:tblPrEx>
         <w:trPr>
           <w:jc w:val="center"/>
@@ -16078,8 +16057,6 @@
         </w:rPr>
         <w:t>在项目周期内，将优先保证登录、户口管理、人口管理、迁入迁出和证件管理等核心功能完整可用。在此基础上，根据实际进度补充多条件查询、统计看板、操作日志、数据导出等增强功能，提高系统完整性和答辩展示效果。</w:t>
       </w:r>
-      <w:bookmarkStart w:id="36" w:name="_GoBack"/>
-      <w:bookmarkEnd w:id="36"/>
     </w:p>
     <w:p>
       <w:pPr>
@@ -16533,7 +16510,7 @@
     <w:lsdException w:uiPriority="99" w:name="Body Text First Indent"/>
     <w:lsdException w:uiPriority="99" w:name="Body Text First Indent 2"/>
     <w:lsdException w:uiPriority="99" w:name="Note Heading"/>
-    <w:lsdException w:uiPriority="99" w:semiHidden="0" w:name="Body Text 2"/>
+    <w:lsdException w:qFormat="1" w:uiPriority="99" w:semiHidden="0" w:name="Body Text 2"/>
     <w:lsdException w:qFormat="1" w:uiPriority="99" w:semiHidden="0" w:name="Body Text 3"/>
     <w:lsdException w:uiPriority="99" w:name="Body Text Indent 2"/>
     <w:lsdException w:uiPriority="99" w:name="Body Text Indent 3"/>
@@ -16545,7 +16522,7 @@
     <w:lsdException w:uiPriority="99" w:name="Document Map"/>
     <w:lsdException w:uiPriority="99" w:name="Plain Text"/>
     <w:lsdException w:uiPriority="99" w:name="E-mail Signature"/>
-    <w:lsdException w:uiPriority="99" w:name="Normal (Web)"/>
+    <w:lsdException w:qFormat="1" w:uiPriority="99" w:name="Normal (Web)"/>
     <w:lsdException w:uiPriority="99" w:name="HTML Acronym"/>
     <w:lsdException w:uiPriority="99" w:name="HTML Address"/>
     <w:lsdException w:uiPriority="99" w:name="HTML Cite"/>
@@ -16636,7 +16613,7 @@
     <w:lsdException w:qFormat="1" w:unhideWhenUsed="0" w:uiPriority="72" w:semiHidden="0" w:name="Colorful List Accent 1"/>
     <w:lsdException w:qFormat="1" w:unhideWhenUsed="0" w:uiPriority="73" w:semiHidden="0" w:name="Colorful Grid Accent 1"/>
     <w:lsdException w:unhideWhenUsed="0" w:uiPriority="60" w:semiHidden="0" w:name="Light Shading Accent 2"/>
-    <w:lsdException w:unhideWhenUsed="0" w:uiPriority="61" w:semiHidden="0" w:name="Light List Accent 2"/>
+    <w:lsdException w:qFormat="1" w:unhideWhenUsed="0" w:uiPriority="61" w:semiHidden="0" w:name="Light List Accent 2"/>
     <w:lsdException w:unhideWhenUsed="0" w:uiPriority="62" w:semiHidden="0" w:name="Light Grid Accent 2"/>
     <w:lsdException w:qFormat="1" w:unhideWhenUsed="0" w:uiPriority="63" w:semiHidden="0" w:name="Medium Shading 1 Accent 2"/>
     <w:lsdException w:qFormat="1" w:unhideWhenUsed="0" w:uiPriority="64" w:semiHidden="0" w:name="Medium Shading 2 Accent 2"/>
@@ -16664,7 +16641,7 @@
     <w:lsdException w:qFormat="1" w:unhideWhenUsed="0" w:uiPriority="72" w:semiHidden="0" w:name="Colorful List Accent 3"/>
     <w:lsdException w:qFormat="1" w:unhideWhenUsed="0" w:uiPriority="73" w:semiHidden="0" w:name="Colorful Grid Accent 3"/>
     <w:lsdException w:unhideWhenUsed="0" w:uiPriority="60" w:semiHidden="0" w:name="Light Shading Accent 4"/>
-    <w:lsdException w:unhideWhenUsed="0" w:uiPriority="61" w:semiHidden="0" w:name="Light List Accent 4"/>
+    <w:lsdException w:qFormat="1" w:unhideWhenUsed="0" w:uiPriority="61" w:semiHidden="0" w:name="Light List Accent 4"/>
     <w:lsdException w:qFormat="1" w:unhideWhenUsed="0" w:uiPriority="62" w:semiHidden="0" w:name="Light Grid Accent 4"/>
     <w:lsdException w:qFormat="1" w:unhideWhenUsed="0" w:uiPriority="63" w:semiHidden="0" w:name="Medium Shading 1 Accent 4"/>
     <w:lsdException w:qFormat="1" w:unhideWhenUsed="0" w:uiPriority="64" w:semiHidden="0" w:name="Medium Shading 2 Accent 4"/>
@@ -16677,7 +16654,7 @@
     <w:lsdException w:qFormat="1" w:unhideWhenUsed="0" w:uiPriority="71" w:semiHidden="0" w:name="Colorful Shading Accent 4"/>
     <w:lsdException w:qFormat="1" w:unhideWhenUsed="0" w:uiPriority="72" w:semiHidden="0" w:name="Colorful List Accent 4"/>
     <w:lsdException w:qFormat="1" w:unhideWhenUsed="0" w:uiPriority="73" w:semiHidden="0" w:name="Colorful Grid Accent 4"/>
-    <w:lsdException w:unhideWhenUsed="0" w:uiPriority="60" w:semiHidden="0" w:name="Light Shading Accent 5"/>
+    <w:lsdException w:qFormat="1" w:unhideWhenUsed="0" w:uiPriority="60" w:semiHidden="0" w:name="Light Shading Accent 5"/>
     <w:lsdException w:qFormat="1" w:unhideWhenUsed="0" w:uiPriority="61" w:semiHidden="0" w:name="Light List Accent 5"/>
     <w:lsdException w:qFormat="1" w:unhideWhenUsed="0" w:uiPriority="62" w:semiHidden="0" w:name="Light Grid Accent 5"/>
     <w:lsdException w:qFormat="1" w:unhideWhenUsed="0" w:uiPriority="63" w:semiHidden="0" w:name="Medium Shading 1 Accent 5"/>
@@ -17277,6 +17254,7 @@
     <w:basedOn w:val="1"/>
     <w:link w:val="149"/>
     <w:unhideWhenUsed/>
+    <w:qFormat/>
     <w:uiPriority w:val="99"/>
     <w:pPr>
       <w:spacing w:after="120" w:line="480" w:lineRule="auto"/>
@@ -17299,6 +17277,7 @@
     <w:basedOn w:val="1"/>
     <w:semiHidden/>
     <w:unhideWhenUsed/>
+    <w:qFormat/>
     <w:uiPriority w:val="99"/>
     <w:pPr>
       <w:spacing w:before="0" w:beforeAutospacing="1" w:after="0" w:afterAutospacing="1"/>
@@ -17871,6 +17850,7 @@
   <w:style w:type="table" w:styleId="43">
     <w:name w:val="Light Shading Accent 5"/>
     <w:basedOn w:val="36"/>
+    <w:qFormat/>
     <w:uiPriority w:val="60"/>
     <w:pPr>
       <w:spacing w:after="0" w:line="240" w:lineRule="auto"/>
@@ -18257,6 +18237,7 @@
   <w:style w:type="table" w:styleId="47">
     <w:name w:val="Light List Accent 2"/>
     <w:basedOn w:val="36"/>
+    <w:qFormat/>
     <w:uiPriority w:val="61"/>
     <w:pPr>
       <w:spacing w:after="0" w:line="240" w:lineRule="auto"/>
@@ -18444,6 +18425,7 @@
   <w:style w:type="table" w:styleId="49">
     <w:name w:val="Light List Accent 4"/>
     <w:basedOn w:val="36"/>
+    <w:qFormat/>
     <w:uiPriority w:val="61"/>
     <w:pPr>
       <w:spacing w:after="0" w:line="240" w:lineRule="auto"/>

</xml_diff>